<commit_message>
Refresh .docx with updated statuses, due dates, and progress updates
</commit_message>
<xml_diff>
--- a/Monthly EnVar Progress Reports/2026-04 EnVar Progress Report.docx
+++ b/Monthly EnVar Progress Reports/2026-04 EnVar Progress Report.docx
@@ -445,7 +445,7 @@
               <w:br/>
               <w:t>• Created Google Drive folder: https://drive.google.com/drive/folders/0ADJCDDiDri_mUk9PVA</w:t>
               <w:br/>
-              <w:t>• Created CLAD Slack channel for daily operations: niehs-standards</w:t>
+              <w:t>• Created Slack channel for daily operations: niehs-standards</w:t>
             </w:r>
           </w:p>
         </w:tc>
@@ -559,7 +559,7 @@
                 <w:color w:val="000000"/>
                 <w:sz w:val="18"/>
               </w:rPr>
-              <w:t>Deprecated</w:t>
+              <w:t>Complete</w:t>
             </w:r>
           </w:p>
         </w:tc>
@@ -603,9 +603,9 @@
                 <w:color w:val="000000"/>
                 <w:sz w:val="18"/>
               </w:rPr>
-              <w:t>Progress Report – April 24:</w:t>
+              <w:t>Progress Report – April 2026:</w:t>
               <w:br/>
-              <w:t>We cannot onboard them to CLAD as they need to be paid staff to access the DLP platform. This was decided by Melissa and Julie. Deprecating this issue.</w:t>
+              <w:t>Successfully onboarded TISLab members to CLAD as CLAD Guests. They will not have access to Foundry as they need to be paid staff to access the DLP platform.</w:t>
             </w:r>
           </w:p>
         </w:tc>
@@ -741,7 +741,7 @@
                 <w:color w:val="000000"/>
                 <w:sz w:val="18"/>
               </w:rPr>
-              <w:t>Apr 24, 2026</w:t>
+              <w:t>Apr 29, 2026</w:t>
             </w:r>
           </w:p>
         </w:tc>
@@ -901,7 +901,7 @@
                 <w:color w:val="000000"/>
                 <w:sz w:val="18"/>
               </w:rPr>
-              <w:t>May 1, 2026</w:t>
+              <w:t>May 29, 2026</w:t>
             </w:r>
           </w:p>
         </w:tc>
@@ -925,7 +925,7 @@
               </w:rPr>
               <w:t>Progress Report – April 28:</w:t>
               <w:br/>
-              <w:t>Work on Deliverable 2.2 is currently in progress, with a substantial technical audit shared during the recent project meeting. We have completed a review of the emerging OMOP CDM GIS extension, documenting the utility of the new External Exposure and Location History tables alongside new vocabularies for GIS, Expozone, and SDOH. A primary outcome of this audit is the formal identification of why current OHDSI approaches are inadequate for complex environmental data: specifically, the “metadata loss” that occurs when high resolution spatial and temporal metrics, such as uncertainty values and grid resolution, are stripped away during ingestion into standard clinical tables. To set the baseline for required model changes, the team has moved into an active prototyping phase, selecting two critical NIEHS data sources to demonstrate a full pipeline that preserves these essential environmental “nuggets” before they enter the Gaia catalog.</w:t>
+              <w:t>Work on Deliverable 2.2 is currently in progress, with a substantial technical audit shared during the recent project meeting. We have completed a review of the emerging OMOP CDM GIS extension, documenting the utility of the new External Exposure and Location History tables alongside new vocabularies for GIS, Exposome, and SDOH. A primary outcome of this audit is the formal identification of why current OHDSI approaches are inadequate for complex environmental data: specifically, the “metadata loss” that occurs when high resolution spatial and temporal metrics, such as uncertainty values and grid resolution, are stripped away during ingestion into standard clinical tables. To set the baseline for required model changes, the team has moved into an active prototyping phase, selecting two critical NIEHS data sources to demonstrate a full pipeline that preserves these essential environmental “nuggets” before they enter the Gaia catalog.</w:t>
             </w:r>
           </w:p>
         </w:tc>

</xml_diff>